<commit_message>
fix part 1 - adding Stakeholders
</commit_message>
<xml_diff>
--- a/SRS - Software Requirements Specification.docx
+++ b/SRS - Software Requirements Specification.docx
@@ -495,10 +495,137 @@
       </w:r>
       <w:r>
         <w:rPr>
-          <w:rtl/>
-        </w:rPr>
-        <w:t>אמנם הם לא משתמשים במערכת, אך הם מושפעים מאיכות התיקונים (באגים) המנוהלים בה. אם המערכת תהיה יעילה, הם יקבלו מוצר טוב יותר</w:t>
-      </w:r>
+          <w:rFonts w:hint="cs"/>
+          <w:rtl/>
+        </w:rPr>
+        <w:t>א</w:t>
+      </w:r>
+      <w:r>
+        <w:rPr>
+          <w:rtl/>
+        </w:rPr>
+        <w:t>מנם אינם משתמשים במערכת ישירות, אך הם משפיעים עליה דרך תלונות ובאגים שמדווחים לארגון, אשר נכנסים כמשימות חדשות במערכת ומכתיבים את סדרי העדיפויות והעומס בה. השפעה שלילית אפשרית: לחץ ליישם פיצ’רים ייעודיים לטיפול בפניות לקוחות שאינם בליבת המערכת ועלולים להסיט אותה ממטרתה.</w:t>
+      </w:r>
+    </w:p>
+    <w:p>
+      <w:pPr>
+        <w:numPr>
+          <w:ilvl w:val="0"/>
+          <w:numId w:val="2"/>
+        </w:numPr>
+        <w:bidi/>
+        <w:spacing w:line="276" w:lineRule="auto"/>
+      </w:pPr>
+      <w:r>
+        <w:rPr>
+          <w:b/>
+          <w:bCs/>
+          <w:rtl/>
+        </w:rPr>
+        <w:t>מתחרים בשוק (</w:t>
+      </w:r>
+      <w:r>
+        <w:rPr>
+          <w:b/>
+          <w:bCs/>
+        </w:rPr>
+        <w:t>Jira, Trello, Asana, Monday</w:t>
+      </w:r>
+      <w:r>
+        <w:rPr>
+          <w:b/>
+          <w:bCs/>
+          <w:rtl/>
+        </w:rPr>
+        <w:t>)</w:t>
+      </w:r>
+      <w:r>
+        <w:rPr>
+          <w:b/>
+          <w:bCs/>
+        </w:rPr>
+        <w:t>:</w:t>
+      </w:r>
+      <w:r>
+        <w:t xml:space="preserve"> </w:t>
+      </w:r>
+      <w:r>
+        <w:rPr>
+          <w:rtl/>
+        </w:rPr>
+        <w:t xml:space="preserve">פלטפורמות ניהול משימות מבוססות שמהוות סטנדרט שוק וקובעות את ציפיות המשתמשים מממשק ופיצ’רים. השפעתם על המערכת היא בכך שהם מציבים את "רף הכניסה" שאליו המשתמשים הפוטנציאליים משווים. </w:t>
+      </w:r>
+      <w:r>
+        <w:rPr>
+          <w:rtl/>
+        </w:rPr>
+        <w:lastRenderedPageBreak/>
+        <w:t xml:space="preserve">השפעה שלילית מובהקת: משתמשים עלולים לדחות את המערכת אם היא לא מציעה לפחות חלק מהיכולות הבסיסיות שהם רגילים אליהן (סינון, תיוג, ייצוא), מה שמכריח אותנו להשקיע משאבים בפיצ’רים "חובה" במקום בייחודיות התחומית של </w:t>
+      </w:r>
+      <w:r>
+        <w:t>TaskMaster Pro</w:t>
+      </w:r>
+      <w:r>
+        <w:rPr>
+          <w:rtl/>
+        </w:rPr>
+        <w:t>.</w:t>
+      </w:r>
+    </w:p>
+    <w:p>
+      <w:pPr>
+        <w:numPr>
+          <w:ilvl w:val="0"/>
+          <w:numId w:val="2"/>
+        </w:numPr>
+        <w:bidi/>
+        <w:spacing w:line="276" w:lineRule="auto"/>
+      </w:pPr>
+      <w:r>
+        <w:rPr>
+          <w:b/>
+          <w:bCs/>
+          <w:rtl/>
+        </w:rPr>
+        <w:t>מחלקת משאבי אנוש (</w:t>
+      </w:r>
+      <w:r>
+        <w:rPr>
+          <w:b/>
+          <w:bCs/>
+        </w:rPr>
+        <w:t>HR</w:t>
+      </w:r>
+      <w:r>
+        <w:rPr>
+          <w:b/>
+          <w:bCs/>
+          <w:rtl/>
+        </w:rPr>
+        <w:t>) של הארגון</w:t>
+      </w:r>
+      <w:r>
+        <w:rPr>
+          <w:b/>
+          <w:bCs/>
+        </w:rPr>
+        <w:t>:</w:t>
+      </w:r>
+      <w:r>
+        <w:t xml:space="preserve"> </w:t>
+      </w:r>
+      <w:r>
+        <w:rPr>
+          <w:rtl/>
+        </w:rPr>
+        <w:t>מעוניינים בנתוני המערכת לצורכי הערכת ביצועים של עובדים – כמות משימות שנסגרו, עמידה בלוחות זמנים וכדומה. השפעה שלילית מובהקת: לחץ אפשרי להוסיף יכולות מעקב ו"מדידת פרודוקטיביות" שעלולות לפגוע באמון המשתמשים במערכת ולגרום להם להפסיק להשתמש בה או למלא בה נתונים לא מדויקים. דרישה זו מנוגדת לדרישת הפרטיות בסעיף הדרישות הלא פונקציונליות.</w:t>
+      </w:r>
+    </w:p>
+    <w:p>
+      <w:pPr>
+        <w:bidi/>
+        <w:ind w:left="720"/>
+      </w:pPr>
     </w:p>
     <w:p>
       <w:pPr>
@@ -2156,9 +2283,16 @@
       </w:r>
       <w:r>
         <w:rPr>
-          <w:rtl/>
-        </w:rPr>
-        <w:t>המשחק יהיה ידידותי, כך שמשתמש חדש יוכל להבין את הממשק ולהשלים פעולת יצירת משימה ראשונה בתוך פחות מ-2 דקות מרגע הכניסה הראשונית למערכת</w:t>
+          <w:rFonts w:hint="cs"/>
+          <w:rtl/>
+        </w:rPr>
+        <w:t>הממשק</w:t>
+      </w:r>
+      <w:r>
+        <w:rPr>
+          <w:rtl/>
+        </w:rPr>
+        <w:t xml:space="preserve"> יהיה ידידותי, כך שמשתמש חדש יוכל להבין את הממשק ולהשלים פעולת יצירת משימה ראשונה בתוך פחות מ-2 דקות מרגע הכניסה הראשונית למערכת</w:t>
       </w:r>
       <w:r>
         <w:t>.</w:t>
@@ -6514,7 +6648,7 @@
   <w:abstractNum w:abstractNumId="24" w15:restartNumberingAfterBreak="0">
     <w:nsid w:val="7A07435F"/>
     <w:multiLevelType w:val="multilevel"/>
-    <w:tmpl w:val="879AB78C"/>
+    <w:tmpl w:val="76028C22"/>
     <w:lvl w:ilvl="0">
       <w:start w:val="1"/>
       <w:numFmt w:val="decimal"/>
@@ -6698,6 +6832,18 @@
   </w:num>
   <w:num w:numId="25" w16cid:durableId="292058391">
     <w:abstractNumId w:val="9"/>
+  </w:num>
+  <w:num w:numId="26" w16cid:durableId="880169158">
+    <w:abstractNumId w:val="15"/>
+    <w:lvlOverride w:ilvl="0"/>
+    <w:lvlOverride w:ilvl="1"/>
+    <w:lvlOverride w:ilvl="2"/>
+    <w:lvlOverride w:ilvl="3"/>
+    <w:lvlOverride w:ilvl="4"/>
+    <w:lvlOverride w:ilvl="5"/>
+    <w:lvlOverride w:ilvl="6"/>
+    <w:lvlOverride w:ilvl="7"/>
+    <w:lvlOverride w:ilvl="8"/>
   </w:num>
 </w:numbering>
 </file>

</xml_diff>

<commit_message>
fix part 1 - last
</commit_message>
<xml_diff>
--- a/SRS - Software Requirements Specification.docx
+++ b/SRS - Software Requirements Specification.docx
@@ -15,6 +15,7 @@
           <w:rtl/>
         </w:rPr>
       </w:pPr>
+      <w:proofErr w:type="spellStart"/>
       <w:r>
         <w:rPr>
           <w:rFonts w:hint="cs"/>
@@ -25,10 +26,12 @@
           <w:u w:val="single"/>
           <w:rtl/>
         </w:rPr>
-        <w:t xml:space="preserve">פרוייקט הנדסת תוכנה </w:t>
-      </w:r>
-      <w:r>
-        <w:rPr>
+        <w:t>פרוייקט</w:t>
+      </w:r>
+      <w:proofErr w:type="spellEnd"/>
+      <w:r>
+        <w:rPr>
+          <w:rFonts w:hint="cs"/>
           <w:b/>
           <w:bCs/>
           <w:sz w:val="28"/>
@@ -36,11 +39,10 @@
           <w:u w:val="single"/>
           <w:rtl/>
         </w:rPr>
-        <w:t>–</w:t>
-      </w:r>
-      <w:r>
-        <w:rPr>
-          <w:rFonts w:hint="cs"/>
+        <w:t xml:space="preserve"> הנדסת תוכנה </w:t>
+      </w:r>
+      <w:r>
+        <w:rPr>
           <w:b/>
           <w:bCs/>
           <w:sz w:val="28"/>
@@ -48,71 +50,19 @@
           <w:u w:val="single"/>
           <w:rtl/>
         </w:rPr>
+        <w:t>–</w:t>
+      </w:r>
+      <w:r>
+        <w:rPr>
+          <w:rFonts w:hint="cs"/>
+          <w:b/>
+          <w:bCs/>
+          <w:sz w:val="28"/>
+          <w:szCs w:val="28"/>
+          <w:u w:val="single"/>
+          <w:rtl/>
+        </w:rPr>
         <w:t xml:space="preserve"> חלק א</w:t>
-      </w:r>
-    </w:p>
-    <w:p>
-      <w:pPr>
-        <w:bidi/>
-        <w:rPr>
-          <w:b/>
-          <w:bCs/>
-          <w:rtl/>
-        </w:rPr>
-      </w:pPr>
-      <w:r>
-        <w:rPr>
-          <w:b/>
-          <w:bCs/>
-          <w:rtl/>
-        </w:rPr>
-        <w:t xml:space="preserve">מסמך דרישות: </w:t>
-      </w:r>
-      <w:r>
-        <w:rPr>
-          <w:b/>
-          <w:bCs/>
-        </w:rPr>
-        <w:t>TaskMaster Pro</w:t>
-      </w:r>
-    </w:p>
-    <w:p>
-      <w:pPr>
-        <w:bidi/>
-        <w:rPr>
-          <w:rtl/>
-        </w:rPr>
-      </w:pPr>
-      <w:r>
-        <w:rPr>
-          <w:b/>
-          <w:bCs/>
-          <w:rtl/>
-        </w:rPr>
-        <w:t>קורס</w:t>
-      </w:r>
-      <w:r>
-        <w:rPr>
-          <w:b/>
-          <w:bCs/>
-        </w:rPr>
-        <w:t>:</w:t>
-      </w:r>
-      <w:r>
-        <w:t xml:space="preserve"> </w:t>
-      </w:r>
-      <w:r>
-        <w:rPr>
-          <w:rtl/>
-        </w:rPr>
-        <w:t>הנדסת תוכנ</w:t>
-      </w:r>
-      <w:r>
-        <w:rPr>
-          <w:rFonts w:hint="cs"/>
-          <w:rtl/>
-        </w:rPr>
-        <w:t>ה</w:t>
       </w:r>
     </w:p>
     <w:p>
@@ -181,12 +131,21 @@
           <w:bCs/>
         </w:rPr>
       </w:pPr>
-      <w:r>
-        <w:rPr>
-          <w:b/>
-          <w:bCs/>
-        </w:rPr>
-        <w:t>TaskMaster Pro</w:t>
+      <w:proofErr w:type="spellStart"/>
+      <w:r>
+        <w:rPr>
+          <w:b/>
+          <w:bCs/>
+        </w:rPr>
+        <w:t>TaskMaster</w:t>
+      </w:r>
+      <w:proofErr w:type="spellEnd"/>
+      <w:r>
+        <w:rPr>
+          <w:b/>
+          <w:bCs/>
+        </w:rPr>
+        <w:t xml:space="preserve"> Pro</w:t>
       </w:r>
     </w:p>
     <w:p>
@@ -226,12 +185,21 @@
         </w:rPr>
         <w:t xml:space="preserve">מערכת </w:t>
       </w:r>
-      <w:r>
-        <w:rPr>
-          <w:b/>
-          <w:bCs/>
-        </w:rPr>
-        <w:t>TaskMaster Pro</w:t>
+      <w:proofErr w:type="spellStart"/>
+      <w:r>
+        <w:rPr>
+          <w:b/>
+          <w:bCs/>
+        </w:rPr>
+        <w:t>TaskMaster</w:t>
+      </w:r>
+      <w:proofErr w:type="spellEnd"/>
+      <w:r>
+        <w:rPr>
+          <w:b/>
+          <w:bCs/>
+        </w:rPr>
+        <w:t xml:space="preserve"> Pro</w:t>
       </w:r>
       <w:r>
         <w:t xml:space="preserve"> </w:t>
@@ -553,17 +521,15 @@
         <w:rPr>
           <w:rtl/>
         </w:rPr>
-        <w:t xml:space="preserve">פלטפורמות ניהול משימות מבוססות שמהוות סטנדרט שוק וקובעות את ציפיות המשתמשים מממשק ופיצ’רים. השפעתם על המערכת היא בכך שהם מציבים את "רף הכניסה" שאליו המשתמשים הפוטנציאליים משווים. </w:t>
-      </w:r>
-      <w:r>
-        <w:rPr>
-          <w:rtl/>
-        </w:rPr>
-        <w:lastRenderedPageBreak/>
-        <w:t xml:space="preserve">השפעה שלילית מובהקת: משתמשים עלולים לדחות את המערכת אם היא לא מציעה לפחות חלק מהיכולות הבסיסיות שהם רגילים אליהן (סינון, תיוג, ייצוא), מה שמכריח אותנו להשקיע משאבים בפיצ’רים "חובה" במקום בייחודיות התחומית של </w:t>
-      </w:r>
-      <w:r>
-        <w:t>TaskMaster Pro</w:t>
+        <w:t xml:space="preserve">פלטפורמות ניהול משימות מבוססות שמהוות סטנדרט שוק וקובעות את ציפיות המשתמשים מממשק ופיצ’רים. השפעתם על המערכת היא בכך שהם מציבים את "רף הכניסה" שאליו המשתמשים הפוטנציאליים משווים. השפעה שלילית מובהקת: משתמשים עלולים לדחות את המערכת אם היא לא מציעה לפחות חלק מהיכולות הבסיסיות שהם רגילים אליהן (סינון, תיוג, ייצוא), מה שמכריח אותנו להשקיע משאבים בפיצ’רים "חובה" במקום בייחודיות התחומית של </w:t>
+      </w:r>
+      <w:proofErr w:type="spellStart"/>
+      <w:r>
+        <w:t>TaskMaster</w:t>
+      </w:r>
+      <w:proofErr w:type="spellEnd"/>
+      <w:r>
+        <w:t xml:space="preserve"> Pro</w:t>
       </w:r>
       <w:r>
         <w:rPr>
@@ -587,6 +553,7 @@
           <w:bCs/>
           <w:rtl/>
         </w:rPr>
+        <w:lastRenderedPageBreak/>
         <w:t>מחלקת משאבי אנוש (</w:t>
       </w:r>
       <w:r>
@@ -1380,7 +1347,25 @@
           <w:rtl/>
         </w:rPr>
         <w:lastRenderedPageBreak/>
-        <w:t>תצוגת דשבורד סיכומי</w:t>
+        <w:t xml:space="preserve">תצוגת </w:t>
+      </w:r>
+      <w:proofErr w:type="spellStart"/>
+      <w:r>
+        <w:rPr>
+          <w:b/>
+          <w:bCs/>
+          <w:rtl/>
+        </w:rPr>
+        <w:t>דשבורד</w:t>
+      </w:r>
+      <w:proofErr w:type="spellEnd"/>
+      <w:r>
+        <w:rPr>
+          <w:b/>
+          <w:bCs/>
+          <w:rtl/>
+        </w:rPr>
+        <w:t xml:space="preserve"> סיכומי</w:t>
       </w:r>
       <w:r>
         <w:rPr>
@@ -1584,7 +1569,21 @@
         <w:rPr>
           <w:rtl/>
         </w:rPr>
-        <w:t>המערכת תאפשר למשתמש לסיים את הסשן הנוכחי</w:t>
+        <w:t xml:space="preserve">המערכת תאפשר למשתמש לסיים את </w:t>
+      </w:r>
+      <w:proofErr w:type="spellStart"/>
+      <w:r>
+        <w:rPr>
+          <w:rtl/>
+        </w:rPr>
+        <w:t>הסשן</w:t>
+      </w:r>
+      <w:proofErr w:type="spellEnd"/>
+      <w:r>
+        <w:rPr>
+          <w:rtl/>
+        </w:rPr>
+        <w:t xml:space="preserve"> הנוכחי</w:t>
       </w:r>
       <w:r>
         <w:t xml:space="preserve">; </w:t>
@@ -1765,7 +1764,21 @@
         <w:rPr>
           <w:rtl/>
         </w:rPr>
-        <w:t>המערכת אינה מתממשקת ואינה מסתנכרנת עם יומנים חיצוניים</w:t>
+        <w:t xml:space="preserve">המערכת אינה מתממשקת ואינה </w:t>
+      </w:r>
+      <w:proofErr w:type="spellStart"/>
+      <w:r>
+        <w:rPr>
+          <w:rtl/>
+        </w:rPr>
+        <w:t>מסתנכרנת</w:t>
+      </w:r>
+      <w:proofErr w:type="spellEnd"/>
+      <w:r>
+        <w:rPr>
+          <w:rtl/>
+        </w:rPr>
+        <w:t xml:space="preserve"> עם יומנים חיצוניים</w:t>
       </w:r>
       <w:r>
         <w:t xml:space="preserve"> (</w:t>
@@ -2962,7 +2975,15 @@
         <w:t>בהתאם לסטנדרטים לפיתוח תוכנה</w:t>
       </w:r>
       <w:r>
-        <w:t xml:space="preserve"> (JavaDoc).</w:t>
+        <w:t xml:space="preserve"> (</w:t>
+      </w:r>
+      <w:proofErr w:type="spellStart"/>
+      <w:r>
+        <w:t>JavaDoc</w:t>
+      </w:r>
+      <w:proofErr w:type="spellEnd"/>
+      <w:r>
+        <w:t>).</w:t>
       </w:r>
     </w:p>
     <w:p>
@@ -3255,7 +3276,21 @@
         <w:rPr>
           <w:rtl/>
         </w:rPr>
-        <w:t xml:space="preserve"> משוב מיידי במקרה של הקלדת תווים לא חוקיים (לדוגמה: הזנת אותיות בשדה המיועד למספרים) ולא </w:t>
+        <w:t xml:space="preserve"> משוב </w:t>
+      </w:r>
+      <w:proofErr w:type="spellStart"/>
+      <w:r>
+        <w:rPr>
+          <w:rtl/>
+        </w:rPr>
+        <w:t>מיידי</w:t>
+      </w:r>
+      <w:proofErr w:type="spellEnd"/>
+      <w:r>
+        <w:rPr>
+          <w:rtl/>
+        </w:rPr>
+        <w:t xml:space="preserve"> במקרה של הקלדת תווים לא חוקיים (לדוגמה: הזנת אותיות בשדה המיועד למספרים) ולא </w:t>
       </w:r>
       <w:r>
         <w:rPr>

</xml_diff>